<commit_message>
changes to home conlsting page subpage
</commit_message>
<xml_diff>
--- a/AeroSpark_Academy_Final_Course_Catalog.docx
+++ b/AeroSpark_Academy_Final_Course_Catalog.docx
@@ -7,13 +7,23 @@
         <w:spacing w:before="1400"/>
         <w:jc w:val="center"/>
       </w:pPr>
+      <w:proofErr w:type="spellStart"/>
       <w:r>
         <w:rPr>
           <w:b/>
           <w:color w:val="17365D"/>
           <w:sz w:val="60"/>
         </w:rPr>
-        <w:t>AeroSpark Academy</w:t>
+        <w:t>AeroSpark</w:t>
+      </w:r>
+      <w:proofErr w:type="spellEnd"/>
+      <w:r>
+        <w:rPr>
+          <w:b/>
+          <w:color w:val="17365D"/>
+          <w:sz w:val="60"/>
+        </w:rPr>
+        <w:t xml:space="preserve"> Academy</w:t>
       </w:r>
     </w:p>
     <w:p>

</xml_diff>